<commit_message>
this is the last time I promise
</commit_message>
<xml_diff>
--- a/MSG GDD.docx
+++ b/MSG GDD.docx
@@ -5,21 +5,66 @@
     <w:p>
       <w:pPr>
         <w:rPr>
-          <w:rFonts w:eastAsia="Hannotate TC"/>
-        </w:rPr>
-      </w:pPr>
-      <w:r>
-        <w:rPr>
           <w:rStyle w:val="Heading1Char"/>
         </w:rPr>
+      </w:pPr>
+      <w:r>
+        <w:rPr>
+          <w:rStyle w:val="Heading1Char"/>
+        </w:rPr>
+        <w:t>MSG: Maniac Seagull Game</w:t>
+      </w:r>
+    </w:p>
+    <w:p>
+      <w:pPr>
+        <w:rPr>
+          <w:rFonts w:eastAsia="Hannotate TC"/>
+        </w:rPr>
+      </w:pPr>
+      <w:r>
+        <w:rPr>
+          <w:rFonts w:eastAsia="Hannotate TC"/>
+        </w:rPr>
+        <w:t>by Isaac</w:t>
+      </w:r>
+      <w:r>
+        <w:rPr>
+          <w:rFonts w:eastAsia="Hannotate TC"/>
+        </w:rPr>
+        <w:t xml:space="preserve"> Grayson</w:t>
+      </w:r>
+      <w:r>
+        <w:rPr>
+          <w:rFonts w:eastAsia="Hannotate TC"/>
+        </w:rPr>
+        <w:t xml:space="preserve"> and Jasper</w:t>
+      </w:r>
+      <w:r>
+        <w:rPr>
+          <w:rFonts w:eastAsia="Hannotate TC"/>
+        </w:rPr>
+        <w:t xml:space="preserve"> Swingler</w:t>
+      </w:r>
+    </w:p>
+    <w:p>
+      <w:pPr>
+        <w:rPr>
+          <w:rFonts w:eastAsia="Hannotate TC"/>
+        </w:rPr>
+      </w:pPr>
+    </w:p>
+    <w:p>
+      <w:pPr>
+        <w:rPr>
+          <w:rFonts w:eastAsia="Hannotate TC"/>
+        </w:rPr>
+      </w:pPr>
+      <w:r>
+        <w:rPr>
+          <w:rStyle w:val="Heading1Char"/>
+        </w:rPr>
         <w:t>Planning</w:t>
       </w:r>
-      <w:r>
-        <w:rPr>
-          <w:rFonts w:eastAsia="Hannotate TC"/>
-        </w:rPr>
-        <w:t>:</w:t>
-      </w:r>
     </w:p>
     <w:p>
       <w:pPr>
@@ -32,12 +77,6 @@
           <w:rStyle w:val="Heading2Char"/>
         </w:rPr>
         <w:t>Organisation</w:t>
-      </w:r>
-      <w:r>
-        <w:rPr>
-          <w:rFonts w:eastAsia="Hannotate TC"/>
-        </w:rPr>
-        <w:t>:</w:t>
       </w:r>
     </w:p>
     <w:p>
@@ -211,16 +250,8 @@
         <w:rPr>
           <w:rFonts w:eastAsia="Hannotate TC"/>
         </w:rPr>
-        <w:t xml:space="preserve">In our game you are a seagull that can squawk at humans, steal chips, complete quests and play minigames. The objective is to complete all the quests and get the lowest score on minigames making it </w:t>
-      </w:r>
-      <w:proofErr w:type="spellStart"/>
-      <w:r>
-        <w:rPr>
-          <w:rFonts w:eastAsia="Hannotate TC"/>
-        </w:rPr>
-        <w:t>replayable</w:t>
-      </w:r>
-      <w:proofErr w:type="spellEnd"/>
+        <w:t>In our game you are a seagull that can squawk at humans, steal chips, complete quests and play minigames. The objective is to complete all the quests and get the lowest score on minigames making it replayable</w:t>
+      </w:r>
       <w:r>
         <w:rPr>
           <w:rFonts w:eastAsia="Hannotate TC"/>
@@ -446,12 +477,6 @@
         </w:rPr>
         <w:t>Inspiration and points of originality</w:t>
       </w:r>
-      <w:r>
-        <w:rPr>
-          <w:rFonts w:eastAsia="Hannotate TC"/>
-        </w:rPr>
-        <w:t>:</w:t>
-      </w:r>
     </w:p>
     <w:p>
       <w:pPr>
@@ -535,6 +560,7 @@
         <w:rPr>
           <w:rFonts w:eastAsia="Hannotate TC"/>
         </w:rPr>
+        <w:lastRenderedPageBreak/>
         <w:t xml:space="preserve">The quest system is a bit like the one from </w:t>
       </w:r>
       <w:r>
@@ -661,14 +687,7 @@
         <w:rPr>
           <w:rFonts w:eastAsia="Hannotate TC"/>
         </w:rPr>
-        <w:t xml:space="preserve"> worth making, as even if </w:t>
-      </w:r>
-      <w:r>
-        <w:rPr>
-          <w:rFonts w:eastAsia="Hannotate TC"/>
-        </w:rPr>
-        <w:lastRenderedPageBreak/>
-        <w:t>it’s similar to those other games, it’s still different enough to be worth it and can be easily spun off into a different game easily.</w:t>
+        <w:t xml:space="preserve"> worth making, as even if it’s similar to those other games, it’s still different enough to be worth it and can be easily spun off into a different game easily.</w:t>
       </w:r>
     </w:p>
     <w:p>
@@ -682,12 +701,6 @@
           <w:rStyle w:val="Heading2Char"/>
         </w:rPr>
         <w:t>Technical Requirements</w:t>
-      </w:r>
-      <w:r>
-        <w:rPr>
-          <w:rFonts w:eastAsia="Hannotate TC"/>
-        </w:rPr>
-        <w:t>:</w:t>
       </w:r>
     </w:p>
     <w:p>
@@ -831,177 +844,241 @@
         <w:rPr>
           <w:rFonts w:eastAsia="Hannotate TC"/>
         </w:rPr>
+        <w:t>w</w:t>
+      </w:r>
+      <w:r>
+        <w:rPr>
+          <w:rFonts w:eastAsia="Hannotate TC"/>
+        </w:rPr>
+        <w:t>e</w:t>
+      </w:r>
+      <w:r>
+        <w:rPr>
+          <w:rFonts w:eastAsia="Hannotate TC"/>
+        </w:rPr>
+        <w:t xml:space="preserve"> have used for other projects. Other game engines like </w:t>
+      </w:r>
+      <w:r>
+        <w:rPr>
+          <w:rFonts w:eastAsia="Hannotate TC"/>
+        </w:rPr>
+        <w:t>U</w:t>
+      </w:r>
+      <w:r>
+        <w:rPr>
+          <w:rFonts w:eastAsia="Hannotate TC"/>
+        </w:rPr>
+        <w:t xml:space="preserve">nity have the asset store which are </w:t>
+      </w:r>
+      <w:r>
+        <w:rPr>
+          <w:rFonts w:eastAsia="Hannotate TC"/>
+        </w:rPr>
+        <w:t>bonuses,</w:t>
+      </w:r>
+      <w:r>
+        <w:rPr>
+          <w:rFonts w:eastAsia="Hannotate TC"/>
+        </w:rPr>
+        <w:t xml:space="preserve"> and Godot is still an emerging engine, with less tutorials and a 3d engine not quite as built out as Unity’s</w:t>
+      </w:r>
+      <w:r>
+        <w:rPr>
+          <w:rFonts w:eastAsia="Hannotate TC"/>
+        </w:rPr>
+        <w:t xml:space="preserve"> but </w:t>
+      </w:r>
+      <w:r>
+        <w:rPr>
+          <w:rFonts w:eastAsia="Hannotate TC"/>
+        </w:rPr>
+        <w:t>Godot</w:t>
+      </w:r>
+      <w:r>
+        <w:rPr>
+          <w:rFonts w:eastAsia="Hannotate TC"/>
+        </w:rPr>
+        <w:t xml:space="preserve"> is simple and you don’t need to bother with paying to release your game late</w:t>
+      </w:r>
+      <w:r>
+        <w:rPr>
+          <w:rFonts w:eastAsia="Hannotate TC"/>
+        </w:rPr>
+        <w:t>r</w:t>
+      </w:r>
+      <w:r>
+        <w:rPr>
+          <w:rFonts w:eastAsia="Hannotate TC"/>
+        </w:rPr>
+        <w:t>, Unity’s cryptic Error messages or difficult coding language</w:t>
+      </w:r>
+      <w:r>
+        <w:rPr>
+          <w:rFonts w:eastAsia="Hannotate TC"/>
+        </w:rPr>
+        <w:t>.</w:t>
+      </w:r>
+      <w:r>
+        <w:rPr>
+          <w:rFonts w:eastAsia="Hannotate TC"/>
+        </w:rPr>
+        <w:t xml:space="preserve"> </w:t>
+      </w:r>
+      <w:r>
+        <w:rPr>
+          <w:rFonts w:eastAsia="Hannotate TC"/>
+        </w:rPr>
+        <w:t xml:space="preserve">You will require </w:t>
+      </w:r>
+      <w:r>
+        <w:rPr>
+          <w:rFonts w:eastAsia="Hannotate TC"/>
+        </w:rPr>
+        <w:t xml:space="preserve">an </w:t>
+      </w:r>
+      <w:r>
+        <w:rPr>
+          <w:rFonts w:eastAsia="Hannotate TC"/>
+        </w:rPr>
+        <w:t>input device and something to play it on. Keyboard and mouse is standard</w:t>
+      </w:r>
+      <w:r>
+        <w:rPr>
+          <w:rFonts w:eastAsia="Hannotate TC"/>
+        </w:rPr>
+        <w:t>,</w:t>
+      </w:r>
+      <w:r>
+        <w:rPr>
+          <w:rFonts w:eastAsia="Hannotate TC"/>
+        </w:rPr>
+        <w:t xml:space="preserve"> as controller support is present but not fully supported or recommended</w:t>
+      </w:r>
+      <w:r>
+        <w:rPr>
+          <w:rFonts w:eastAsia="Hannotate TC"/>
+        </w:rPr>
+        <w:t>.</w:t>
+      </w:r>
+      <w:r>
+        <w:rPr>
+          <w:rFonts w:eastAsia="Hannotate TC"/>
+        </w:rPr>
+        <w:t xml:space="preserve"> If </w:t>
+      </w:r>
+      <w:r>
+        <w:rPr>
+          <w:rFonts w:eastAsia="Hannotate TC"/>
+        </w:rPr>
+        <w:t>a</w:t>
+      </w:r>
+      <w:r>
+        <w:rPr>
+          <w:rFonts w:eastAsia="Hannotate TC"/>
+        </w:rPr>
+        <w:t xml:space="preserve">vailable, </w:t>
+      </w:r>
+      <w:r>
+        <w:rPr>
+          <w:rFonts w:eastAsia="Hannotate TC"/>
+        </w:rPr>
+        <w:t>speakers or headphones</w:t>
+      </w:r>
+      <w:r>
+        <w:rPr>
+          <w:rFonts w:eastAsia="Hannotate TC"/>
+        </w:rPr>
+        <w:t xml:space="preserve"> are also recommended</w:t>
+      </w:r>
+      <w:r>
+        <w:rPr>
+          <w:rFonts w:eastAsia="Hannotate TC"/>
+        </w:rPr>
+        <w:t xml:space="preserve"> to listen to the beautiful soundtrack.</w:t>
+      </w:r>
+      <w:r>
+        <w:rPr>
+          <w:rFonts w:eastAsia="Hannotate TC"/>
+        </w:rPr>
+        <w:t xml:space="preserve"> The game is not super resource heavy, but </w:t>
+      </w:r>
+      <w:r>
+        <w:rPr>
+          <w:rFonts w:eastAsia="Hannotate TC"/>
+        </w:rPr>
+        <w:t>we</w:t>
+      </w:r>
+      <w:r>
+        <w:rPr>
+          <w:rFonts w:eastAsia="Hannotate TC"/>
+        </w:rPr>
+        <w:t xml:space="preserve"> do recommend a PC</w:t>
+      </w:r>
+      <w:r>
+        <w:rPr>
+          <w:rFonts w:eastAsia="Hannotate TC"/>
+        </w:rPr>
+        <w:t xml:space="preserve"> with a dedicated graphics card</w:t>
+      </w:r>
+      <w:r>
+        <w:rPr>
+          <w:rFonts w:eastAsia="Hannotate TC"/>
+        </w:rPr>
+        <w:t>.</w:t>
+      </w:r>
+      <w:r>
+        <w:rPr>
+          <w:rFonts w:eastAsia="Hannotate TC"/>
+        </w:rPr>
+        <w:t xml:space="preserve"> </w:t>
+      </w:r>
+      <w:r>
+        <w:rPr>
+          <w:rFonts w:eastAsia="Hannotate TC"/>
+        </w:rPr>
+        <w:t>Our test</w:t>
+      </w:r>
+      <w:r>
+        <w:rPr>
+          <w:rFonts w:eastAsia="Hannotate TC"/>
+        </w:rPr>
+        <w:t xml:space="preserve"> PC runs it at a standard 60 fps and drops to 30 when in or looking at the voxel ocean. </w:t>
+      </w:r>
+      <w:r>
+        <w:rPr>
+          <w:rFonts w:eastAsia="Hannotate TC"/>
+        </w:rPr>
         <w:t>We</w:t>
       </w:r>
       <w:r>
         <w:rPr>
           <w:rFonts w:eastAsia="Hannotate TC"/>
         </w:rPr>
-        <w:t xml:space="preserve"> have used for other projects. Other game engines like </w:t>
-      </w:r>
-      <w:r>
-        <w:rPr>
-          <w:rFonts w:eastAsia="Hannotate TC"/>
-        </w:rPr>
-        <w:t>U</w:t>
-      </w:r>
-      <w:r>
-        <w:rPr>
-          <w:rFonts w:eastAsia="Hannotate TC"/>
-        </w:rPr>
-        <w:t xml:space="preserve">nity have the asset store which are </w:t>
-      </w:r>
-      <w:r>
-        <w:rPr>
-          <w:rFonts w:eastAsia="Hannotate TC"/>
-        </w:rPr>
-        <w:t>bonuses,</w:t>
-      </w:r>
-      <w:r>
-        <w:rPr>
-          <w:rFonts w:eastAsia="Hannotate TC"/>
-        </w:rPr>
-        <w:t xml:space="preserve"> and Godot is still an emerging engine, with less tutorials and a 3d engine not quite as built out as Unity’s</w:t>
-      </w:r>
-      <w:r>
-        <w:rPr>
-          <w:rFonts w:eastAsia="Hannotate TC"/>
-        </w:rPr>
-        <w:t xml:space="preserve"> but </w:t>
-      </w:r>
-      <w:r>
-        <w:rPr>
-          <w:rFonts w:eastAsia="Hannotate TC"/>
-        </w:rPr>
-        <w:t>Godot</w:t>
-      </w:r>
-      <w:r>
-        <w:rPr>
-          <w:rFonts w:eastAsia="Hannotate TC"/>
-        </w:rPr>
-        <w:t xml:space="preserve"> is simple and you don’t need to bother with paying to release your game late</w:t>
-      </w:r>
-      <w:r>
-        <w:rPr>
-          <w:rFonts w:eastAsia="Hannotate TC"/>
-        </w:rPr>
-        <w:t>r</w:t>
-      </w:r>
-      <w:r>
-        <w:rPr>
-          <w:rFonts w:eastAsia="Hannotate TC"/>
-        </w:rPr>
-        <w:t>, Unity’s cryptic Error messages or difficult coding language</w:t>
-      </w:r>
-      <w:r>
-        <w:rPr>
-          <w:rFonts w:eastAsia="Hannotate TC"/>
-        </w:rPr>
-        <w:t>.</w:t>
-      </w:r>
-      <w:r>
-        <w:rPr>
-          <w:rFonts w:eastAsia="Hannotate TC"/>
-        </w:rPr>
         <w:t xml:space="preserve"> </w:t>
       </w:r>
       <w:r>
         <w:rPr>
           <w:rFonts w:eastAsia="Hannotate TC"/>
         </w:rPr>
-        <w:t xml:space="preserve">You will require </w:t>
-      </w:r>
-      <w:r>
-        <w:rPr>
-          <w:rFonts w:eastAsia="Hannotate TC"/>
-        </w:rPr>
-        <w:t xml:space="preserve">an </w:t>
-      </w:r>
-      <w:r>
-        <w:rPr>
-          <w:rFonts w:eastAsia="Hannotate TC"/>
-        </w:rPr>
-        <w:t xml:space="preserve">input device and something to play it on. Keyboard and mouse </w:t>
-      </w:r>
-      <w:proofErr w:type="gramStart"/>
-      <w:r>
-        <w:rPr>
-          <w:rFonts w:eastAsia="Hannotate TC"/>
-        </w:rPr>
-        <w:t>is</w:t>
-      </w:r>
-      <w:proofErr w:type="gramEnd"/>
-      <w:r>
-        <w:rPr>
-          <w:rFonts w:eastAsia="Hannotate TC"/>
-        </w:rPr>
-        <w:t xml:space="preserve"> standard</w:t>
-      </w:r>
-      <w:r>
-        <w:rPr>
-          <w:rFonts w:eastAsia="Hannotate TC"/>
-        </w:rPr>
-        <w:t>,</w:t>
-      </w:r>
-      <w:r>
-        <w:rPr>
-          <w:rFonts w:eastAsia="Hannotate TC"/>
-        </w:rPr>
-        <w:t xml:space="preserve"> as controller support is present but not fully supported or recommended</w:t>
-      </w:r>
-      <w:r>
-        <w:rPr>
-          <w:rFonts w:eastAsia="Hannotate TC"/>
-        </w:rPr>
-        <w:t>.</w:t>
-      </w:r>
-      <w:r>
-        <w:rPr>
-          <w:rFonts w:eastAsia="Hannotate TC"/>
-        </w:rPr>
-        <w:t xml:space="preserve"> If Available, </w:t>
-      </w:r>
-      <w:r>
-        <w:rPr>
-          <w:rFonts w:eastAsia="Hannotate TC"/>
-        </w:rPr>
-        <w:t>speakers or headphones</w:t>
-      </w:r>
-      <w:r>
-        <w:rPr>
-          <w:rFonts w:eastAsia="Hannotate TC"/>
-        </w:rPr>
-        <w:t xml:space="preserve"> are also recommended</w:t>
-      </w:r>
-      <w:r>
-        <w:rPr>
-          <w:rFonts w:eastAsia="Hannotate TC"/>
-        </w:rPr>
-        <w:t xml:space="preserve"> to listen to the beautiful soundtrack.</w:t>
-      </w:r>
-      <w:r>
-        <w:rPr>
-          <w:rFonts w:eastAsia="Hannotate TC"/>
-        </w:rPr>
-        <w:t xml:space="preserve"> The game is not super resource heavy, but I do recommend a PC</w:t>
-      </w:r>
-      <w:r>
-        <w:rPr>
-          <w:rFonts w:eastAsia="Hannotate TC"/>
-        </w:rPr>
-        <w:t xml:space="preserve"> with a dedicated graphics card</w:t>
-      </w:r>
-      <w:r>
-        <w:rPr>
-          <w:rFonts w:eastAsia="Hannotate TC"/>
-        </w:rPr>
-        <w:t>.</w:t>
-      </w:r>
-      <w:r>
-        <w:rPr>
-          <w:rFonts w:eastAsia="Hannotate TC"/>
-        </w:rPr>
-        <w:t xml:space="preserve"> My PC run’s it at a standard 60 fps and drops to 30 when in or looking at the voxel ocean. I Tested it on my friends MacBook </w:t>
+        <w:t>t</w:t>
+      </w:r>
+      <w:r>
+        <w:rPr>
+          <w:rFonts w:eastAsia="Hannotate TC"/>
+        </w:rPr>
+        <w:t xml:space="preserve">ested it on </w:t>
+      </w:r>
+      <w:r>
+        <w:rPr>
+          <w:rFonts w:eastAsia="Hannotate TC"/>
+        </w:rPr>
+        <w:t>our</w:t>
+      </w:r>
+      <w:r>
+        <w:rPr>
+          <w:rFonts w:eastAsia="Hannotate TC"/>
+        </w:rPr>
+        <w:t xml:space="preserve"> friends MacBook </w:t>
       </w:r>
       <w:r>
         <w:rPr>
@@ -1019,7 +1096,13 @@
         <w:rPr>
           <w:rFonts w:eastAsia="Hannotate TC"/>
         </w:rPr>
-        <w:t>like 5ish fps when in water</w:t>
+        <w:t xml:space="preserve">like 5ish fps when in </w:t>
+      </w:r>
+      <w:r>
+        <w:rPr>
+          <w:rFonts w:eastAsia="Hannotate TC"/>
+        </w:rPr>
+        <w:t>ocean</w:t>
       </w:r>
       <w:r>
         <w:rPr>
@@ -1098,12 +1181,6 @@
         </w:rPr>
         <w:t>Designing</w:t>
       </w:r>
-      <w:r>
-        <w:rPr>
-          <w:rFonts w:eastAsia="Hannotate TC"/>
-        </w:rPr>
-        <w:t>:</w:t>
-      </w:r>
     </w:p>
     <w:p>
       <w:pPr>
@@ -1116,12 +1193,6 @@
           <w:rStyle w:val="Heading2Char"/>
         </w:rPr>
         <w:t>Game overview</w:t>
-      </w:r>
-      <w:r>
-        <w:rPr>
-          <w:rFonts w:eastAsia="Hannotate TC"/>
-        </w:rPr>
-        <w:t>:</w:t>
       </w:r>
     </w:p>
     <w:p>
@@ -1155,6 +1226,7 @@
         <w:rPr>
           <w:rFonts w:eastAsia="Hannotate TC"/>
         </w:rPr>
+        <w:lastRenderedPageBreak/>
         <w:t>Our game is called MSG</w:t>
       </w:r>
       <w:r>
@@ -1272,7 +1344,6 @@
           <w:b/>
           <w:bCs/>
         </w:rPr>
-        <w:lastRenderedPageBreak/>
         <w:t>Game Description</w:t>
       </w:r>
       <w:r>
@@ -1292,35 +1363,7 @@
         <w:rPr>
           <w:rFonts w:eastAsia="Hannotate TC"/>
         </w:rPr>
-        <w:t xml:space="preserve">In our game you are a seagull that is trying to make life as miserable for humans as possible. You fly around and complete quests and find new little secrets as you go and of course, poo and steal chips from humans. The end goal is to complete all the quests. Our game is intended for teenagers, kids and young adults. In our game you can fly around and just be yourself. Careful not to knock over the building, nudge </w:t>
-      </w:r>
-      <w:proofErr w:type="spellStart"/>
-      <w:r>
-        <w:rPr>
-          <w:rFonts w:eastAsia="Hannotate TC"/>
-        </w:rPr>
-        <w:t>nudge</w:t>
-      </w:r>
-      <w:proofErr w:type="spellEnd"/>
-      <w:r>
-        <w:rPr>
-          <w:rFonts w:eastAsia="Hannotate TC"/>
-        </w:rPr>
-        <w:t xml:space="preserve"> wink </w:t>
-      </w:r>
-      <w:proofErr w:type="spellStart"/>
-      <w:r>
-        <w:rPr>
-          <w:rFonts w:eastAsia="Hannotate TC"/>
-        </w:rPr>
-        <w:t>wink</w:t>
-      </w:r>
-      <w:proofErr w:type="spellEnd"/>
-      <w:r>
-        <w:rPr>
-          <w:rFonts w:eastAsia="Hannotate TC"/>
-        </w:rPr>
-        <w:t>. You get to blow stuff up, knock stuff down, poo on people, complete quests, steal chips, have a dance, and meet a new secret friend.</w:t>
+        <w:t>In our game you are a seagull that is trying to make life as miserable for humans as possible. You fly around and complete quests and find new little secrets as you go and of course, poo and steal chips from humans. The end goal is to complete all the quests. Our game is intended for teenagers, kids and young adults. In our game you can fly around and just be yourself. Careful not to knock over the building, nudge nudge wink wink. You get to blow stuff up, knock stuff down, poo on people, complete quests, steal chips, have a dance, and meet a new secret friend.</w:t>
       </w:r>
       <w:r>
         <w:rPr>
@@ -1350,7 +1393,19 @@
         <w:rPr>
           <w:rFonts w:eastAsia="Hannotate TC"/>
         </w:rPr>
-        <w:t xml:space="preserve"> The Humans, Essential to the game, t</w:t>
+        <w:t xml:space="preserve"> The Humans, </w:t>
+      </w:r>
+      <w:r>
+        <w:rPr>
+          <w:rFonts w:eastAsia="Hannotate TC"/>
+        </w:rPr>
+        <w:t>e</w:t>
+      </w:r>
+      <w:r>
+        <w:rPr>
+          <w:rFonts w:eastAsia="Hannotate TC"/>
+        </w:rPr>
+        <w:t>ssential to the game, t</w:t>
       </w:r>
       <w:r>
         <w:rPr>
@@ -1374,21 +1429,55 @@
         <w:rPr>
           <w:rFonts w:eastAsia="Hannotate TC"/>
         </w:rPr>
-        <w:t xml:space="preserve">Sean, </w:t>
-      </w:r>
-      <w:proofErr w:type="gramStart"/>
-      <w:r>
-        <w:rPr>
-          <w:rFonts w:eastAsia="Hannotate TC"/>
-        </w:rPr>
-        <w:t>Only</w:t>
-      </w:r>
-      <w:proofErr w:type="gramEnd"/>
-      <w:r>
-        <w:rPr>
-          <w:rFonts w:eastAsia="Hannotate TC"/>
-        </w:rPr>
-        <w:t xml:space="preserve"> uncovered later in the game Sean the sea monster can also be found in the game and spawned as a pet to follow you through the world with ‘P’</w:t>
+        <w:t>Sean</w:t>
+      </w:r>
+      <w:r>
+        <w:rPr>
+          <w:rFonts w:eastAsia="Hannotate TC"/>
+        </w:rPr>
+        <w:t xml:space="preserve"> the sea monster</w:t>
+      </w:r>
+      <w:r>
+        <w:rPr>
+          <w:rFonts w:eastAsia="Hannotate TC"/>
+        </w:rPr>
+        <w:t xml:space="preserve">, </w:t>
+      </w:r>
+      <w:r>
+        <w:rPr>
+          <w:rFonts w:eastAsia="Hannotate TC"/>
+        </w:rPr>
+        <w:t>only</w:t>
+      </w:r>
+      <w:r>
+        <w:rPr>
+          <w:rFonts w:eastAsia="Hannotate TC"/>
+        </w:rPr>
+        <w:t xml:space="preserve"> uncovered later in the game</w:t>
+      </w:r>
+      <w:r>
+        <w:rPr>
+          <w:rFonts w:eastAsia="Hannotate TC"/>
+        </w:rPr>
+        <w:t>,</w:t>
+      </w:r>
+      <w:r>
+        <w:rPr>
+          <w:rFonts w:eastAsia="Hannotate TC"/>
+        </w:rPr>
+        <w:t xml:space="preserve"> can also be found and spawned as a pet to follow you through the world with ‘P’</w:t>
+      </w:r>
+      <w:r>
+        <w:rPr>
+          <w:rFonts w:eastAsia="Hannotate TC"/>
+        </w:rPr>
+        <w:t xml:space="preserve"> once unlocked</w:t>
+      </w:r>
+      <w:r>
+        <w:rPr>
+          <w:rFonts w:eastAsia="Hannotate TC"/>
+        </w:rPr>
+        <w:t>.</w:t>
       </w:r>
     </w:p>
     <w:p>
@@ -1467,12 +1556,6 @@
         </w:rPr>
         <w:t>Theme</w:t>
       </w:r>
-      <w:r>
-        <w:rPr>
-          <w:rFonts w:eastAsia="Hannotate TC"/>
-        </w:rPr>
-        <w:t>:</w:t>
-      </w:r>
     </w:p>
     <w:p>
       <w:pPr>
@@ -1498,6 +1581,12 @@
         </w:rPr>
         <w:t xml:space="preserve"> theme is oceans</w:t>
       </w:r>
+      <w:r>
+        <w:rPr>
+          <w:rFonts w:eastAsia="Hannotate TC"/>
+        </w:rPr>
+        <w:t>.</w:t>
+      </w:r>
     </w:p>
     <w:p>
       <w:pPr>
@@ -1535,12 +1624,6 @@
           <w:rStyle w:val="Heading2Char"/>
         </w:rPr>
         <w:t>cs</w:t>
-      </w:r>
-      <w:r>
-        <w:rPr>
-          <w:rFonts w:eastAsia="Hannotate TC"/>
-        </w:rPr>
-        <w:t>:</w:t>
       </w:r>
     </w:p>
     <w:p>
@@ -1598,7 +1681,13 @@
         <w:rPr>
           <w:rFonts w:eastAsia="Hannotate TC"/>
         </w:rPr>
-        <w:t xml:space="preserve"> no “</w:t>
+        <w:t xml:space="preserve"> no </w:t>
+      </w:r>
+      <w:r>
+        <w:rPr>
+          <w:rFonts w:eastAsia="Hannotate TC"/>
+        </w:rPr>
+        <w:t>‘</w:t>
       </w:r>
       <w:r>
         <w:rPr>
@@ -1610,7 +1699,19 @@
         <w:rPr>
           <w:rFonts w:eastAsia="Hannotate TC"/>
         </w:rPr>
-        <w:t xml:space="preserve">evels” </w:t>
+        <w:t>evels</w:t>
+      </w:r>
+      <w:r>
+        <w:rPr>
+          <w:rFonts w:eastAsia="Hannotate TC"/>
+        </w:rPr>
+        <w:t>’</w:t>
+      </w:r>
+      <w:r>
+        <w:rPr>
+          <w:rFonts w:eastAsia="Hannotate TC"/>
+        </w:rPr>
+        <w:t xml:space="preserve"> </w:t>
       </w:r>
       <w:r>
         <w:rPr>
@@ -1642,6 +1743,7 @@
       <w:r>
         <w:rPr>
           <w:rFonts w:eastAsia="Hannotate TC"/>
+          <w:noProof/>
         </w:rPr>
         <w:lastRenderedPageBreak/>
         <w:drawing>
@@ -2058,12 +2160,6 @@
         </w:rPr>
         <w:t>isual and Audio Design</w:t>
       </w:r>
-      <w:r>
-        <w:rPr>
-          <w:rFonts w:eastAsia="Hannotate TC"/>
-        </w:rPr>
-        <w:t>:</w:t>
-      </w:r>
     </w:p>
     <w:p>
       <w:pPr>
@@ -2278,6 +2374,7 @@
       <w:r>
         <w:rPr>
           <w:rFonts w:eastAsia="Hannotate TC"/>
+          <w:noProof/>
         </w:rPr>
         <w:drawing>
           <wp:inline distT="0" distB="0" distL="0" distR="0" wp14:anchorId="5160E425" wp14:editId="5756B676">
@@ -2571,14 +2668,12 @@
         </w:rPr>
         <w:t xml:space="preserve">We did not create the audio on our game, and instead we went on royalty free download websites such as </w:t>
       </w:r>
-      <w:proofErr w:type="spellStart"/>
       <w:r>
         <w:rPr>
           <w:rFonts w:eastAsia="Hannotate TC"/>
         </w:rPr>
         <w:t>Pixabay</w:t>
       </w:r>
-      <w:proofErr w:type="spellEnd"/>
       <w:r>
         <w:rPr>
           <w:rFonts w:eastAsia="Hannotate TC"/>
@@ -2604,49 +2699,19 @@
         <w:t xml:space="preserve"> </w:t>
       </w:r>
       <w:hyperlink r:id="rId11" w:history="1">
-        <w:proofErr w:type="spellStart"/>
         <w:r>
           <w:rPr>
             <w:rStyle w:val="Hyperlink"/>
             <w:rFonts w:eastAsia="Hannotate TC"/>
           </w:rPr>
-          <w:t>whatd</w:t>
+          <w:t>whatdoyousee</w:t>
         </w:r>
-        <w:r>
-          <w:rPr>
-            <w:rStyle w:val="Hyperlink"/>
-            <w:rFonts w:eastAsia="Hannotate TC"/>
-          </w:rPr>
-          <w:t>o</w:t>
-        </w:r>
-        <w:r>
-          <w:rPr>
-            <w:rStyle w:val="Hyperlink"/>
-            <w:rFonts w:eastAsia="Hannotate TC"/>
-          </w:rPr>
-          <w:t>yousee</w:t>
-        </w:r>
-        <w:proofErr w:type="spellEnd"/>
       </w:hyperlink>
       <w:r>
         <w:rPr>
           <w:rFonts w:eastAsia="Hannotate TC"/>
         </w:rPr>
-        <w:t xml:space="preserve"> by </w:t>
-      </w:r>
-      <w:proofErr w:type="spellStart"/>
-      <w:r>
-        <w:rPr>
-          <w:rFonts w:eastAsia="Hannotate TC"/>
-        </w:rPr>
-        <w:t>prodBigMike</w:t>
-      </w:r>
-      <w:proofErr w:type="spellEnd"/>
-      <w:r>
-        <w:rPr>
-          <w:rFonts w:eastAsia="Hannotate TC"/>
-        </w:rPr>
-        <w:t xml:space="preserve"> and Glitch Cat, available on NCS. </w:t>
+        <w:t xml:space="preserve"> by prodBigMike and Glitch Cat, available on NCS. </w:t>
       </w:r>
       <w:hyperlink r:id="rId12" w:history="1">
         <w:r>
@@ -2673,21 +2738,7 @@
         <w:rPr>
           <w:rFonts w:eastAsia="Hannotate TC"/>
         </w:rPr>
-        <w:t xml:space="preserve"> available on </w:t>
-      </w:r>
-      <w:proofErr w:type="spellStart"/>
-      <w:r>
-        <w:rPr>
-          <w:rFonts w:eastAsia="Hannotate TC"/>
-        </w:rPr>
-        <w:t>Pixabay</w:t>
-      </w:r>
-      <w:proofErr w:type="spellEnd"/>
-      <w:r>
-        <w:rPr>
-          <w:rFonts w:eastAsia="Hannotate TC"/>
-        </w:rPr>
-        <w:t xml:space="preserve"> under the name: </w:t>
+        <w:t xml:space="preserve"> available on Pixabay under the name: </w:t>
       </w:r>
       <w:hyperlink r:id="rId13" w:history="1">
         <w:r>
@@ -2717,38 +2768,9 @@
         <w:rPr>
           <w:rFonts w:eastAsia="Hannotate TC"/>
         </w:rPr>
-        <w:t xml:space="preserve"> by </w:t>
-      </w:r>
-      <w:proofErr w:type="spellStart"/>
-      <w:r>
-        <w:rPr>
-          <w:rFonts w:eastAsia="Hannotate TC"/>
-        </w:rPr>
-        <w:t>VRZone</w:t>
-      </w:r>
-      <w:proofErr w:type="spellEnd"/>
-      <w:r>
-        <w:rPr>
-          <w:rFonts w:eastAsia="Hannotate TC"/>
-        </w:rPr>
-        <w:t xml:space="preserve"> available on </w:t>
-      </w:r>
-      <w:proofErr w:type="spellStart"/>
-      <w:r>
-        <w:rPr>
-          <w:rFonts w:eastAsia="Hannotate TC"/>
-        </w:rPr>
-        <w:t>Pixabay</w:t>
-      </w:r>
-      <w:proofErr w:type="spellEnd"/>
-      <w:r>
-        <w:rPr>
-          <w:rFonts w:eastAsia="Hannotate TC"/>
-        </w:rPr>
-        <w:t xml:space="preserve"> under the name: </w:t>
+        <w:t xml:space="preserve"> by VRZone available on Pixabay under the name: </w:t>
       </w:r>
       <w:hyperlink r:id="rId15" w:history="1">
-        <w:proofErr w:type="spellStart"/>
         <w:r>
           <w:rPr>
             <w:rStyle w:val="Hyperlink"/>
@@ -2756,7 +2778,6 @@
           </w:rPr>
           <w:t>Phonk</w:t>
         </w:r>
-        <w:proofErr w:type="spellEnd"/>
       </w:hyperlink>
       <w:r>
         <w:rPr>
@@ -2884,12 +2905,6 @@
           <w:rStyle w:val="Heading1Char"/>
         </w:rPr>
         <w:t>Reflecting</w:t>
-      </w:r>
-      <w:r>
-        <w:rPr>
-          <w:rFonts w:eastAsia="Hannotate TC"/>
-        </w:rPr>
-        <w:t>:</w:t>
       </w:r>
     </w:p>
     <w:p>
@@ -3041,21 +3056,7 @@
         <w:rPr>
           <w:rFonts w:eastAsia="Hannotate TC"/>
         </w:rPr>
-        <w:t xml:space="preserve"> the boats, as pretty much everyone got </w:t>
-      </w:r>
-      <w:proofErr w:type="spellStart"/>
-      <w:r>
-        <w:rPr>
-          <w:rFonts w:eastAsia="Hannotate TC"/>
-        </w:rPr>
-        <w:t>softlocked</w:t>
-      </w:r>
-      <w:proofErr w:type="spellEnd"/>
-      <w:r>
-        <w:rPr>
-          <w:rFonts w:eastAsia="Hannotate TC"/>
-        </w:rPr>
-        <w:t xml:space="preserve"> </w:t>
+        <w:t xml:space="preserve"> the boats, as pretty much everyone got softlocked </w:t>
       </w:r>
       <w:r>
         <w:rPr>
@@ -3165,12 +3166,6 @@
         </w:rPr>
         <w:t>ac Reflection</w:t>
       </w:r>
-      <w:r>
-        <w:rPr>
-          <w:rFonts w:eastAsia="Hannotate TC"/>
-        </w:rPr>
-        <w:t>:</w:t>
-      </w:r>
     </w:p>
     <w:p>
       <w:pPr>
@@ -3285,11 +3280,25 @@
         </w:rPr>
         <w:t>Jasper Reflection</w:t>
       </w:r>
-      <w:r>
+    </w:p>
+    <w:p>
+      <w:pPr>
+        <w:pStyle w:val="p-copy"/>
         <w:rPr>
           <w:rFonts w:asciiTheme="minorHAnsi" w:eastAsia="Hannotate TC" w:hAnsiTheme="minorHAnsi"/>
         </w:rPr>
-        <w:t>:</w:t>
+      </w:pPr>
+      <w:r>
+        <w:rPr>
+          <w:rFonts w:asciiTheme="minorHAnsi" w:eastAsia="Hannotate TC" w:hAnsiTheme="minorHAnsi"/>
+        </w:rPr>
+        <w:t>I would like to look more closely into the game engine for next time, as implementations worked, but were often built to just work</w:t>
+      </w:r>
+      <w:r>
+        <w:rPr>
+          <w:rFonts w:asciiTheme="minorHAnsi" w:eastAsia="Hannotate TC" w:hAnsiTheme="minorHAnsi"/>
+        </w:rPr>
+        <w:t xml:space="preserve"> and making different variants of things needed to be hard coded and were not easy to create.</w:t>
       </w:r>
     </w:p>
     <w:p>
@@ -3303,13 +3312,31 @@
         <w:rPr>
           <w:rFonts w:asciiTheme="minorHAnsi" w:eastAsia="Hannotate TC" w:hAnsiTheme="minorHAnsi"/>
         </w:rPr>
-        <w:t>I would like to look more closely into the game engine for next time, as implementations worked, but were often built to just work</w:t>
+        <w:t>I think our teamwork worked well,</w:t>
       </w:r>
       <w:r>
         <w:rPr>
           <w:rFonts w:asciiTheme="minorHAnsi" w:eastAsia="Hannotate TC" w:hAnsiTheme="minorHAnsi"/>
         </w:rPr>
-        <w:t xml:space="preserve"> and making different variants of things needed to be hard coded and were not easy to create.</w:t>
+        <w:t xml:space="preserve"> (and so did the dance floor that thing looks so cool!)</w:t>
+      </w:r>
+      <w:r>
+        <w:rPr>
+          <w:rFonts w:asciiTheme="minorHAnsi" w:eastAsia="Hannotate TC" w:hAnsiTheme="minorHAnsi"/>
+        </w:rPr>
+        <w:t xml:space="preserve"> We worked together a lot during this </w:t>
+      </w:r>
+      <w:r>
+        <w:rPr>
+          <w:rFonts w:asciiTheme="minorHAnsi" w:eastAsia="Hannotate TC" w:hAnsiTheme="minorHAnsi"/>
+        </w:rPr>
+        <w:t>project,</w:t>
+      </w:r>
+      <w:r>
+        <w:rPr>
+          <w:rFonts w:asciiTheme="minorHAnsi" w:eastAsia="Hannotate TC" w:hAnsiTheme="minorHAnsi"/>
+        </w:rPr>
+        <w:t xml:space="preserve"> and it was nice having a bit of the weight off your back and someone you can have fun with while creating the game.</w:t>
       </w:r>
     </w:p>
     <w:p>
@@ -3323,82 +3350,38 @@
         <w:rPr>
           <w:rFonts w:asciiTheme="minorHAnsi" w:eastAsia="Hannotate TC" w:hAnsiTheme="minorHAnsi"/>
         </w:rPr>
-        <w:t>I think our teamwork worked well,</w:t>
+        <w:t xml:space="preserve">I would probably </w:t>
       </w:r>
       <w:r>
         <w:rPr>
           <w:rFonts w:asciiTheme="minorHAnsi" w:eastAsia="Hannotate TC" w:hAnsiTheme="minorHAnsi"/>
         </w:rPr>
-        <w:t xml:space="preserve"> (and so did the dance floor that thing looks so cool!)</w:t>
-      </w:r>
-      <w:r>
+        <w:t>like to look more into Resources in Godot and maybe look at something that we haven’t looked at yet. I would also like to try a different type of game, as I would quite like to make a puzzle game.</w:t>
+      </w:r>
+    </w:p>
+    <w:p>
+      <w:pPr>
+        <w:pStyle w:val="Heading1"/>
+        <w:rPr>
+          <w:rFonts w:eastAsia="Hannotate TC"/>
+        </w:rPr>
+      </w:pPr>
+      <w:r>
+        <w:t>References</w:t>
+      </w:r>
+    </w:p>
+    <w:p>
+      <w:pPr>
+        <w:pStyle w:val="p-copy"/>
         <w:rPr>
           <w:rFonts w:asciiTheme="minorHAnsi" w:eastAsia="Hannotate TC" w:hAnsiTheme="minorHAnsi"/>
         </w:rPr>
-        <w:t xml:space="preserve"> We worked together a lot during this </w:t>
-      </w:r>
-      <w:r>
-        <w:rPr>
-          <w:rFonts w:asciiTheme="minorHAnsi" w:eastAsia="Hannotate TC" w:hAnsiTheme="minorHAnsi"/>
-        </w:rPr>
-        <w:t>project,</w:t>
-      </w:r>
-      <w:r>
-        <w:rPr>
-          <w:rFonts w:asciiTheme="minorHAnsi" w:eastAsia="Hannotate TC" w:hAnsiTheme="minorHAnsi"/>
-        </w:rPr>
-        <w:t xml:space="preserve"> and it was nice having a bit of the weight off your back and someone you can have fun with while creating the game.</w:t>
-      </w:r>
-    </w:p>
-    <w:p>
-      <w:pPr>
-        <w:pStyle w:val="p-copy"/>
-        <w:rPr>
-          <w:rFonts w:asciiTheme="minorHAnsi" w:eastAsia="Hannotate TC" w:hAnsiTheme="minorHAnsi"/>
-        </w:rPr>
-      </w:pPr>
-      <w:r>
-        <w:rPr>
-          <w:rFonts w:asciiTheme="minorHAnsi" w:eastAsia="Hannotate TC" w:hAnsiTheme="minorHAnsi"/>
-        </w:rPr>
-        <w:t xml:space="preserve">I would probably </w:t>
-      </w:r>
-      <w:r>
-        <w:rPr>
-          <w:rFonts w:asciiTheme="minorHAnsi" w:eastAsia="Hannotate TC" w:hAnsiTheme="minorHAnsi"/>
-        </w:rPr>
-        <w:t>like to look more into Resources in Godot and maybe look at something that we haven’t looked at yet. I would also like to try a different type of game, as I would quite like to make a puzzle game.</w:t>
-      </w:r>
-    </w:p>
-    <w:p>
-      <w:pPr>
-        <w:pStyle w:val="Heading1"/>
-        <w:rPr>
-          <w:rFonts w:eastAsia="Hannotate TC"/>
-        </w:rPr>
-      </w:pPr>
-      <w:r>
-        <w:t>References</w:t>
-      </w:r>
-    </w:p>
-    <w:p>
-      <w:pPr>
-        <w:pStyle w:val="p-copy"/>
-        <w:rPr>
-          <w:rFonts w:asciiTheme="minorHAnsi" w:eastAsia="Hannotate TC" w:hAnsiTheme="minorHAnsi"/>
-        </w:rPr>
       </w:pPr>
       <w:r>
         <w:rPr>
           <w:rStyle w:val="Heading2Char"/>
         </w:rPr>
         <w:t>Inspiration Games</w:t>
-      </w:r>
-      <w:r>
-        <w:rPr>
-          <w:rFonts w:asciiTheme="minorHAnsi" w:eastAsia="Hannotate TC" w:hAnsiTheme="minorHAnsi"/>
-        </w:rPr>
-        <w:t>:</w:t>
       </w:r>
     </w:p>
     <w:p>
@@ -3416,21 +3399,7 @@
         <w:rPr>
           <w:rFonts w:asciiTheme="minorHAnsi" w:eastAsia="Hannotate TC" w:hAnsiTheme="minorHAnsi"/>
         </w:rPr>
-        <w:t xml:space="preserve">Untitled Goose Game (2019), House </w:t>
-      </w:r>
-      <w:proofErr w:type="spellStart"/>
-      <w:r>
-        <w:rPr>
-          <w:rFonts w:asciiTheme="minorHAnsi" w:eastAsia="Hannotate TC" w:hAnsiTheme="minorHAnsi"/>
-        </w:rPr>
-        <w:t>House</w:t>
-      </w:r>
-      <w:proofErr w:type="spellEnd"/>
-      <w:r>
-        <w:rPr>
-          <w:rFonts w:asciiTheme="minorHAnsi" w:eastAsia="Hannotate TC" w:hAnsiTheme="minorHAnsi"/>
-        </w:rPr>
-        <w:t xml:space="preserve">. </w:t>
+        <w:t xml:space="preserve">Untitled Goose Game (2019), House House. </w:t>
       </w:r>
       <w:hyperlink r:id="rId16" w:history="1">
         <w:r>
@@ -3506,12 +3475,6 @@
         </w:rPr>
         <w:t>Software</w:t>
       </w:r>
-      <w:r>
-        <w:rPr>
-          <w:rFonts w:asciiTheme="minorHAnsi" w:eastAsia="Hannotate TC" w:hAnsiTheme="minorHAnsi"/>
-        </w:rPr>
-        <w:t>:</w:t>
-      </w:r>
     </w:p>
     <w:p>
       <w:pPr>
@@ -3569,33 +3532,11 @@
           <w:rFonts w:asciiTheme="minorHAnsi" w:eastAsia="Hannotate TC" w:hAnsiTheme="minorHAnsi"/>
         </w:rPr>
       </w:pPr>
-      <w:proofErr w:type="spellStart"/>
       <w:r>
         <w:rPr>
           <w:rFonts w:asciiTheme="minorHAnsi" w:eastAsia="Hannotate TC" w:hAnsiTheme="minorHAnsi"/>
         </w:rPr>
-        <w:t>MagicaVoxel</w:t>
-      </w:r>
-      <w:proofErr w:type="spellEnd"/>
-      <w:r>
-        <w:rPr>
-          <w:rFonts w:asciiTheme="minorHAnsi" w:eastAsia="Hannotate TC" w:hAnsiTheme="minorHAnsi"/>
-        </w:rPr>
-        <w:t xml:space="preserve">, </w:t>
-      </w:r>
-      <w:proofErr w:type="spellStart"/>
-      <w:r>
-        <w:rPr>
-          <w:rFonts w:asciiTheme="minorHAnsi" w:eastAsia="Hannotate TC" w:hAnsiTheme="minorHAnsi"/>
-        </w:rPr>
-        <w:t>ephtracy</w:t>
-      </w:r>
-      <w:proofErr w:type="spellEnd"/>
-      <w:r>
-        <w:rPr>
-          <w:rFonts w:asciiTheme="minorHAnsi" w:eastAsia="Hannotate TC" w:hAnsiTheme="minorHAnsi"/>
-        </w:rPr>
-        <w:t xml:space="preserve"> </w:t>
+        <w:t xml:space="preserve">MagicaVoxel, ephtracy </w:t>
       </w:r>
       <w:r>
         <w:rPr>
@@ -3675,57 +3616,11 @@
           <w:rFonts w:asciiTheme="minorHAnsi" w:eastAsia="Hannotate TC" w:hAnsiTheme="minorHAnsi"/>
         </w:rPr>
       </w:pPr>
-      <w:proofErr w:type="spellStart"/>
       <w:r>
         <w:rPr>
           <w:rFonts w:asciiTheme="minorHAnsi" w:eastAsia="Hannotate TC" w:hAnsiTheme="minorHAnsi"/>
         </w:rPr>
-        <w:t>w</w:t>
-      </w:r>
-      <w:r>
-        <w:rPr>
-          <w:rFonts w:asciiTheme="minorHAnsi" w:eastAsia="Hannotate TC" w:hAnsiTheme="minorHAnsi"/>
-        </w:rPr>
-        <w:t>hatdoyousee</w:t>
-      </w:r>
-      <w:proofErr w:type="spellEnd"/>
-      <w:r>
-        <w:rPr>
-          <w:rFonts w:asciiTheme="minorHAnsi" w:eastAsia="Hannotate TC" w:hAnsiTheme="minorHAnsi"/>
-        </w:rPr>
-        <w:t>,</w:t>
-      </w:r>
-      <w:r>
-        <w:rPr>
-          <w:rFonts w:asciiTheme="minorHAnsi" w:eastAsia="Hannotate TC" w:hAnsiTheme="minorHAnsi"/>
-        </w:rPr>
-        <w:t xml:space="preserve"> </w:t>
-      </w:r>
-      <w:proofErr w:type="spellStart"/>
-      <w:r>
-        <w:rPr>
-          <w:rFonts w:asciiTheme="minorHAnsi" w:eastAsia="Hannotate TC" w:hAnsiTheme="minorHAnsi"/>
-        </w:rPr>
-        <w:t>prodBigMike</w:t>
-      </w:r>
-      <w:proofErr w:type="spellEnd"/>
-      <w:r>
-        <w:rPr>
-          <w:rFonts w:asciiTheme="minorHAnsi" w:eastAsia="Hannotate TC" w:hAnsiTheme="minorHAnsi"/>
-        </w:rPr>
-        <w:t xml:space="preserve"> and Glitch Cat</w:t>
-      </w:r>
-      <w:r>
-        <w:rPr>
-          <w:rFonts w:asciiTheme="minorHAnsi" w:eastAsia="Hannotate TC" w:hAnsiTheme="minorHAnsi"/>
-        </w:rPr>
-        <w:t xml:space="preserve"> - </w:t>
-      </w:r>
-      <w:r>
-        <w:rPr>
-          <w:rFonts w:asciiTheme="minorHAnsi" w:eastAsia="Hannotate TC" w:hAnsiTheme="minorHAnsi"/>
-        </w:rPr>
-        <w:t>https://ncs.io/whatdoyousee.</w:t>
+        <w:t>whatdoyousee, prodBigMike and Glitch Cat - https://ncs.io/whatdoyousee.</w:t>
       </w:r>
     </w:p>
     <w:p>
@@ -3755,19 +3650,7 @@
         <w:rPr>
           <w:rFonts w:asciiTheme="minorHAnsi" w:eastAsia="Hannotate TC" w:hAnsiTheme="minorHAnsi"/>
         </w:rPr>
-        <w:t xml:space="preserve"> STAROSTIN</w:t>
-      </w:r>
-      <w:r>
-        <w:rPr>
-          <w:rFonts w:asciiTheme="minorHAnsi" w:eastAsia="Hannotate TC" w:hAnsiTheme="minorHAnsi"/>
-        </w:rPr>
-        <w:t xml:space="preserve"> - </w:t>
-      </w:r>
-      <w:r>
-        <w:rPr>
-          <w:rFonts w:asciiTheme="minorHAnsi" w:eastAsia="Hannotate TC" w:hAnsiTheme="minorHAnsi"/>
-        </w:rPr>
-        <w:t>https://pixabay.com/music/comedy-comedy-cartoon-funny-background-music-492540/.</w:t>
+        <w:t xml:space="preserve"> STAROSTIN - https://pixabay.com/music/comedy-comedy-cartoon-funny-background-music-492540/.</w:t>
       </w:r>
     </w:p>
     <w:p>
@@ -3781,39 +3664,23 @@
           <w:rFonts w:asciiTheme="minorHAnsi" w:eastAsia="Hannotate TC" w:hAnsiTheme="minorHAnsi"/>
         </w:rPr>
       </w:pPr>
-      <w:proofErr w:type="spellStart"/>
       <w:r>
         <w:rPr>
           <w:rFonts w:asciiTheme="minorHAnsi" w:eastAsia="Hannotate TC" w:hAnsiTheme="minorHAnsi"/>
         </w:rPr>
         <w:t>Phonk</w:t>
       </w:r>
-      <w:proofErr w:type="spellEnd"/>
       <w:r>
         <w:rPr>
           <w:rFonts w:asciiTheme="minorHAnsi" w:eastAsia="Hannotate TC" w:hAnsiTheme="minorHAnsi"/>
         </w:rPr>
         <w:t xml:space="preserve">, </w:t>
       </w:r>
-      <w:proofErr w:type="spellStart"/>
       <w:r>
         <w:rPr>
           <w:rFonts w:asciiTheme="minorHAnsi" w:eastAsia="Hannotate TC" w:hAnsiTheme="minorHAnsi"/>
         </w:rPr>
-        <w:t>VRZone</w:t>
-      </w:r>
-      <w:proofErr w:type="spellEnd"/>
-      <w:r>
-        <w:rPr>
-          <w:rFonts w:asciiTheme="minorHAnsi" w:eastAsia="Hannotate TC" w:hAnsiTheme="minorHAnsi"/>
-        </w:rPr>
-        <w:t xml:space="preserve"> - </w:t>
-      </w:r>
-      <w:r>
-        <w:rPr>
-          <w:rFonts w:asciiTheme="minorHAnsi" w:eastAsia="Hannotate TC" w:hAnsiTheme="minorHAnsi"/>
-        </w:rPr>
-        <w:t>https://pixabay.com/music/phonk-phonk-567414/</w:t>
+        <w:t>VRZone - https://pixabay.com/music/phonk-phonk-567414/</w:t>
       </w:r>
     </w:p>
     <w:p>
@@ -3824,28 +3691,18 @@
           <w:numId w:val="7"/>
         </w:numPr>
         <w:rPr>
+          <w:rStyle w:val="Heading1Char"/>
+          <w:rFonts w:asciiTheme="minorHAnsi" w:eastAsia="Hannotate TC" w:hAnsiTheme="minorHAnsi" w:cs="Times New Roman"/>
+          <w:color w:val="auto"/>
+          <w:sz w:val="24"/>
+          <w:szCs w:val="24"/>
+        </w:rPr>
+      </w:pPr>
+      <w:r>
+        <w:rPr>
           <w:rFonts w:asciiTheme="minorHAnsi" w:eastAsia="Hannotate TC" w:hAnsiTheme="minorHAnsi"/>
         </w:rPr>
-      </w:pPr>
-      <w:r>
-        <w:rPr>
-          <w:rFonts w:asciiTheme="minorHAnsi" w:eastAsia="Hannotate TC" w:hAnsiTheme="minorHAnsi"/>
-        </w:rPr>
-        <w:t xml:space="preserve">Sound effects: </w:t>
-      </w:r>
-      <w:proofErr w:type="spellStart"/>
-      <w:r>
-        <w:rPr>
-          <w:rFonts w:asciiTheme="minorHAnsi" w:eastAsia="Hannotate TC" w:hAnsiTheme="minorHAnsi"/>
-        </w:rPr>
-        <w:t>Pixabay</w:t>
-      </w:r>
-      <w:proofErr w:type="spellEnd"/>
-      <w:r>
-        <w:rPr>
-          <w:rFonts w:asciiTheme="minorHAnsi" w:eastAsia="Hannotate TC" w:hAnsiTheme="minorHAnsi"/>
-        </w:rPr>
-        <w:t xml:space="preserve"> — </w:t>
+        <w:t xml:space="preserve">Sound effects: Pixabay — </w:t>
       </w:r>
       <w:hyperlink r:id="rId22" w:history="1">
         <w:r>
@@ -3859,105 +3716,382 @@
         <w:rPr>
           <w:rFonts w:asciiTheme="minorHAnsi" w:eastAsia="Hannotate TC" w:hAnsiTheme="minorHAnsi"/>
         </w:rPr>
-        <w:t xml:space="preserve"> (</w:t>
-      </w:r>
-      <w:proofErr w:type="spellStart"/>
-      <w:r>
+        <w:t xml:space="preserve"> (Pixabay Content Licence)</w:t>
+      </w:r>
+    </w:p>
+    <w:p>
+      <w:pPr>
+        <w:pStyle w:val="p-copy"/>
         <w:rPr>
           <w:rFonts w:asciiTheme="minorHAnsi" w:eastAsia="Hannotate TC" w:hAnsiTheme="minorHAnsi"/>
         </w:rPr>
-        <w:t>Pixabay</w:t>
-      </w:r>
-      <w:proofErr w:type="spellEnd"/>
-      <w:r>
-        <w:rPr>
-          <w:rFonts w:asciiTheme="minorHAnsi" w:eastAsia="Hannotate TC" w:hAnsiTheme="minorHAnsi"/>
-        </w:rPr>
-        <w:t xml:space="preserve"> Content Licence)</w:t>
-      </w:r>
-    </w:p>
-    <w:p>
-      <w:pPr>
-        <w:pStyle w:val="p-copy"/>
+      </w:pPr>
+      <w:r>
         <w:rPr>
           <w:rStyle w:val="Heading1Char"/>
         </w:rPr>
-      </w:pPr>
-    </w:p>
-    <w:p>
-      <w:pPr>
-        <w:pStyle w:val="p-copy"/>
-        <w:rPr>
-          <w:rStyle w:val="Heading1Char"/>
-        </w:rPr>
-      </w:pPr>
-    </w:p>
-    <w:p>
-      <w:pPr>
-        <w:pStyle w:val="p-copy"/>
-        <w:rPr>
-          <w:rStyle w:val="Heading1Char"/>
-        </w:rPr>
-      </w:pPr>
-    </w:p>
-    <w:p>
-      <w:pPr>
-        <w:pStyle w:val="p-copy"/>
-        <w:rPr>
-          <w:rFonts w:asciiTheme="minorHAnsi" w:eastAsia="Hannotate TC" w:hAnsiTheme="minorHAnsi"/>
-        </w:rPr>
-      </w:pPr>
-      <w:r>
-        <w:rPr>
-          <w:rStyle w:val="Heading1Char"/>
-        </w:rPr>
         <w:t>AI</w:t>
       </w:r>
-      <w:r>
-        <w:rPr>
-          <w:rFonts w:eastAsia="Hannotate TC"/>
-        </w:rPr>
-        <w:t>:</w:t>
-      </w:r>
-    </w:p>
-    <w:p>
-      <w:pPr>
-        <w:rPr>
-          <w:rStyle w:val="Heading1Char"/>
-          <w:rFonts w:asciiTheme="minorHAnsi" w:eastAsia="Hannotate TC" w:hAnsiTheme="minorHAnsi" w:cstheme="minorBidi"/>
-          <w:color w:val="auto"/>
-          <w:sz w:val="24"/>
-          <w:szCs w:val="24"/>
-        </w:rPr>
-      </w:pPr>
-      <w:r>
-        <w:rPr>
-          <w:rFonts w:eastAsia="Hannotate TC"/>
-        </w:rPr>
-        <w:t xml:space="preserve">We used ai in our project for help creating scripts. And fixing GitHub sync issues that corrupted files. AI helped us with the ocean. Specifically trying to optimise it with LODs and fixing layering bugs. It also helped with floating, though I made the first floating code, AI fixed up some bugs with it. AI was used for the </w:t>
-      </w:r>
-      <w:proofErr w:type="spellStart"/>
-      <w:r>
-        <w:rPr>
-          <w:rFonts w:eastAsia="Hannotate TC"/>
-        </w:rPr>
-        <w:t>Megapoo</w:t>
-      </w:r>
-      <w:proofErr w:type="spellEnd"/>
-      <w:r>
-        <w:rPr>
-          <w:rFonts w:eastAsia="Hannotate TC"/>
-        </w:rPr>
-        <w:t xml:space="preserve"> cutscene. It helped with creating the code to build the layers of the cutscene, all the quest integration, and the poo physics was done by us, you can see package.gd for what the code looked like before the AI cutscene code was added. AI also helped, or more created, most of the quest code. This was before we had read the rules of the challenge, it has been edited by us, and all the quests have been added by us. It’s just the quest manager. We did however make the quest complete screen and code ourselves. The Human script was made by us, with minimal debugging help from AI. The Player flying, walking and play animation mechanics were originally made by AI, but we fully rewrite the code after it got super cluttered, using the AI’s flying maths and ideas and writing them ourselves again. All the other player squawking, pooing and cutscenes are all made by us. The debug console was made entirely with AI as it is not in the final game, and we needed it purely for testing purposes. I originally made all of the sound manager mechanics but just got ai to look over it and polish it up. (I made all the actual logic, and it added the push error.) If a script is not mentioned here, it means that we made it entirely or with very, very little help that it is not worth mentioning.</w:t>
-      </w:r>
-    </w:p>
-    <w:p>
-      <w:pPr>
-        <w:pStyle w:val="p-copy"/>
-        <w:rPr>
-          <w:rFonts w:asciiTheme="minorHAnsi" w:eastAsia="Hannotate TC" w:hAnsiTheme="minorHAnsi"/>
-        </w:rPr>
-      </w:pPr>
+    </w:p>
+    <w:p>
+      <w:pPr>
+        <w:rPr>
+          <w:rFonts w:eastAsia="Hannotate TC"/>
+        </w:rPr>
+      </w:pPr>
+      <w:r>
+        <w:rPr>
+          <w:rFonts w:eastAsia="Hannotate TC"/>
+        </w:rPr>
+        <w:t xml:space="preserve">We used </w:t>
+      </w:r>
+      <w:r>
+        <w:rPr>
+          <w:rFonts w:eastAsia="Hannotate TC"/>
+        </w:rPr>
+        <w:t>AI</w:t>
+      </w:r>
+      <w:r>
+        <w:rPr>
+          <w:rFonts w:eastAsia="Hannotate TC"/>
+        </w:rPr>
+        <w:t xml:space="preserve"> in our project for help creating scripts</w:t>
+      </w:r>
+      <w:r>
+        <w:rPr>
+          <w:rFonts w:eastAsia="Hannotate TC"/>
+        </w:rPr>
+        <w:t>,</w:t>
+      </w:r>
+      <w:r>
+        <w:rPr>
+          <w:rFonts w:eastAsia="Hannotate TC"/>
+        </w:rPr>
+        <w:t xml:space="preserve"> </w:t>
+      </w:r>
+      <w:r>
+        <w:rPr>
+          <w:rFonts w:eastAsia="Hannotate TC"/>
+        </w:rPr>
+        <w:t>a</w:t>
+      </w:r>
+      <w:r>
+        <w:rPr>
+          <w:rFonts w:eastAsia="Hannotate TC"/>
+        </w:rPr>
+        <w:t>nd fixing GitHub sync issues that corrupted files. AI helped us with the ocean</w:t>
+      </w:r>
+      <w:r>
+        <w:rPr>
+          <w:rFonts w:eastAsia="Hannotate TC"/>
+        </w:rPr>
+        <w:t>,</w:t>
+      </w:r>
+      <w:r>
+        <w:rPr>
+          <w:rFonts w:eastAsia="Hannotate TC"/>
+        </w:rPr>
+        <w:t xml:space="preserve"> </w:t>
+      </w:r>
+      <w:r>
+        <w:rPr>
+          <w:rFonts w:eastAsia="Hannotate TC"/>
+        </w:rPr>
+        <w:t>s</w:t>
+      </w:r>
+      <w:r>
+        <w:rPr>
+          <w:rFonts w:eastAsia="Hannotate TC"/>
+        </w:rPr>
+        <w:t xml:space="preserve">pecifically trying to optimise it with LODs and fixing layering bugs. It also helped with floating, though </w:t>
+      </w:r>
+      <w:r>
+        <w:rPr>
+          <w:rFonts w:eastAsia="Hannotate TC"/>
+        </w:rPr>
+        <w:t>we</w:t>
+      </w:r>
+      <w:r>
+        <w:rPr>
+          <w:rFonts w:eastAsia="Hannotate TC"/>
+        </w:rPr>
+        <w:t xml:space="preserve"> made the first floating code, AI fixed up some bugs with it.</w:t>
+      </w:r>
+    </w:p>
+    <w:p>
+      <w:pPr>
+        <w:rPr>
+          <w:rFonts w:eastAsia="Hannotate TC"/>
+        </w:rPr>
+      </w:pPr>
+      <w:r>
+        <w:rPr>
+          <w:rFonts w:eastAsia="Hannotate TC"/>
+        </w:rPr>
+        <w:t>AI was used for the Megapoo cutscene. It helped with creating the code to build the layers of the cutscene</w:t>
+      </w:r>
+      <w:r>
+        <w:rPr>
+          <w:rFonts w:eastAsia="Hannotate TC"/>
+        </w:rPr>
+        <w:t xml:space="preserve"> and</w:t>
+      </w:r>
+      <w:r>
+        <w:rPr>
+          <w:rFonts w:eastAsia="Hannotate TC"/>
+        </w:rPr>
+        <w:t xml:space="preserve"> </w:t>
+      </w:r>
+      <w:r>
+        <w:rPr>
+          <w:rFonts w:eastAsia="Hannotate TC"/>
+        </w:rPr>
+        <w:t>t</w:t>
+      </w:r>
+      <w:r>
+        <w:rPr>
+          <w:rFonts w:eastAsia="Hannotate TC"/>
+        </w:rPr>
+        <w:t>he quest integration</w:t>
+      </w:r>
+      <w:r>
+        <w:rPr>
+          <w:rFonts w:eastAsia="Hannotate TC"/>
+        </w:rPr>
+        <w:t>. T</w:t>
+      </w:r>
+      <w:r>
+        <w:rPr>
+          <w:rFonts w:eastAsia="Hannotate TC"/>
+        </w:rPr>
+        <w:t>he poo physics was done by us, you can see package.gd for what the code looked like before the AI cutscene code was added.</w:t>
+      </w:r>
+    </w:p>
+    <w:p>
+      <w:pPr>
+        <w:rPr>
+          <w:rFonts w:eastAsia="Hannotate TC"/>
+        </w:rPr>
+      </w:pPr>
+      <w:r>
+        <w:rPr>
+          <w:rFonts w:eastAsia="Hannotate TC"/>
+        </w:rPr>
+        <w:t>AI also helped</w:t>
+      </w:r>
+      <w:r>
+        <w:rPr>
+          <w:rFonts w:eastAsia="Hannotate TC"/>
+        </w:rPr>
+        <w:t xml:space="preserve"> us create</w:t>
+      </w:r>
+      <w:r>
+        <w:rPr>
+          <w:rFonts w:eastAsia="Hannotate TC"/>
+        </w:rPr>
+        <w:t xml:space="preserve"> most of the quest code.</w:t>
+      </w:r>
+      <w:r>
+        <w:rPr>
+          <w:rFonts w:eastAsia="Hannotate TC"/>
+        </w:rPr>
+        <w:t xml:space="preserve"> I</w:t>
+      </w:r>
+      <w:r>
+        <w:rPr>
+          <w:rFonts w:eastAsia="Hannotate TC"/>
+        </w:rPr>
+        <w:t>t has been</w:t>
+      </w:r>
+      <w:r>
+        <w:rPr>
+          <w:rFonts w:eastAsia="Hannotate TC"/>
+        </w:rPr>
+        <w:t xml:space="preserve"> fully</w:t>
+      </w:r>
+      <w:r>
+        <w:rPr>
+          <w:rFonts w:eastAsia="Hannotate TC"/>
+        </w:rPr>
+        <w:t xml:space="preserve"> edited by us, and all the quests have been added by us</w:t>
+      </w:r>
+      <w:r>
+        <w:rPr>
+          <w:rFonts w:eastAsia="Hannotate TC"/>
+        </w:rPr>
+        <w:t xml:space="preserve">. </w:t>
+      </w:r>
+      <w:r>
+        <w:rPr>
+          <w:rFonts w:eastAsia="Hannotate TC"/>
+        </w:rPr>
+        <w:t>We</w:t>
+      </w:r>
+      <w:r>
+        <w:rPr>
+          <w:rFonts w:eastAsia="Hannotate TC"/>
+        </w:rPr>
+        <w:t xml:space="preserve"> also made</w:t>
+      </w:r>
+      <w:r>
+        <w:rPr>
+          <w:rFonts w:eastAsia="Hannotate TC"/>
+        </w:rPr>
+        <w:t xml:space="preserve"> the quest complete screen and code ourselves.</w:t>
+      </w:r>
+    </w:p>
+    <w:p>
+      <w:pPr>
+        <w:rPr>
+          <w:rFonts w:eastAsia="Hannotate TC"/>
+        </w:rPr>
+      </w:pPr>
+      <w:r>
+        <w:rPr>
+          <w:rFonts w:eastAsia="Hannotate TC"/>
+        </w:rPr>
+        <w:t>The Human script was made by us, with minimal debugging help from AI.</w:t>
+      </w:r>
+    </w:p>
+    <w:p>
+      <w:pPr>
+        <w:rPr>
+          <w:rFonts w:eastAsia="Hannotate TC"/>
+        </w:rPr>
+      </w:pPr>
+      <w:r>
+        <w:rPr>
+          <w:rFonts w:eastAsia="Hannotate TC"/>
+        </w:rPr>
+        <w:t xml:space="preserve">The </w:t>
+      </w:r>
+      <w:r>
+        <w:rPr>
+          <w:rFonts w:eastAsia="Hannotate TC"/>
+        </w:rPr>
+        <w:t>code to play the player animations</w:t>
+      </w:r>
+      <w:r>
+        <w:rPr>
+          <w:rFonts w:eastAsia="Hannotate TC"/>
+        </w:rPr>
+        <w:t xml:space="preserve"> w</w:t>
+      </w:r>
+      <w:r>
+        <w:rPr>
+          <w:rFonts w:eastAsia="Hannotate TC"/>
+        </w:rPr>
+        <w:t>as</w:t>
+      </w:r>
+      <w:r>
+        <w:rPr>
+          <w:rFonts w:eastAsia="Hannotate TC"/>
+        </w:rPr>
+        <w:t xml:space="preserve"> originally made by AI, but we fully rewr</w:t>
+      </w:r>
+      <w:r>
+        <w:rPr>
+          <w:rFonts w:eastAsia="Hannotate TC"/>
+        </w:rPr>
+        <w:t>o</w:t>
+      </w:r>
+      <w:r>
+        <w:rPr>
+          <w:rFonts w:eastAsia="Hannotate TC"/>
+        </w:rPr>
+        <w:t>te the code after it got super cluttered, using the AI’s flying maths and ideas and writing them ourselves again.</w:t>
+      </w:r>
+      <w:r>
+        <w:rPr>
+          <w:rFonts w:eastAsia="Hannotate TC"/>
+        </w:rPr>
+        <w:t xml:space="preserve"> </w:t>
+      </w:r>
+      <w:r>
+        <w:rPr>
+          <w:rFonts w:eastAsia="Hannotate TC"/>
+        </w:rPr>
+        <w:t>All the other player squawking, pooing and cutscenes are</w:t>
+      </w:r>
+      <w:r>
+        <w:rPr>
+          <w:rFonts w:eastAsia="Hannotate TC"/>
+        </w:rPr>
+        <w:t xml:space="preserve"> </w:t>
+      </w:r>
+      <w:r>
+        <w:rPr>
+          <w:rFonts w:eastAsia="Hannotate TC"/>
+        </w:rPr>
+        <w:t>made by us.</w:t>
+      </w:r>
+    </w:p>
+    <w:p>
+      <w:pPr>
+        <w:rPr>
+          <w:rFonts w:eastAsia="Hannotate TC"/>
+        </w:rPr>
+      </w:pPr>
+      <w:r>
+        <w:rPr>
+          <w:rFonts w:eastAsia="Hannotate TC"/>
+        </w:rPr>
+        <w:t xml:space="preserve">The debug console was made entirely with AI as it is not in the final game, and we needed it purely for testing purposes. </w:t>
+      </w:r>
+      <w:r>
+        <w:rPr>
+          <w:rFonts w:eastAsia="Hannotate TC"/>
+        </w:rPr>
+        <w:t xml:space="preserve">We </w:t>
+      </w:r>
+      <w:r>
+        <w:rPr>
+          <w:rFonts w:eastAsia="Hannotate TC"/>
+        </w:rPr>
+        <w:t xml:space="preserve">originally made all of the sound manager mechanics but just got </w:t>
+      </w:r>
+      <w:r>
+        <w:rPr>
+          <w:rFonts w:eastAsia="Hannotate TC"/>
+        </w:rPr>
+        <w:t>AI</w:t>
+      </w:r>
+      <w:r>
+        <w:rPr>
+          <w:rFonts w:eastAsia="Hannotate TC"/>
+        </w:rPr>
+        <w:t xml:space="preserve"> to look over it and polish it up (</w:t>
+      </w:r>
+      <w:r>
+        <w:rPr>
+          <w:rFonts w:eastAsia="Hannotate TC"/>
+        </w:rPr>
+        <w:t>we</w:t>
+      </w:r>
+      <w:r>
+        <w:rPr>
+          <w:rFonts w:eastAsia="Hannotate TC"/>
+        </w:rPr>
+        <w:t xml:space="preserve"> made all the actual logic, and it added the push error)</w:t>
+      </w:r>
+      <w:r>
+        <w:rPr>
+          <w:rFonts w:eastAsia="Hannotate TC"/>
+        </w:rPr>
+        <w:t>.</w:t>
+      </w:r>
+      <w:r>
+        <w:rPr>
+          <w:rFonts w:eastAsia="Hannotate TC"/>
+        </w:rPr>
+        <w:t xml:space="preserve"> If a script is not mentioned here, it means that we made it entirely or with </w:t>
+      </w:r>
+      <w:r>
+        <w:rPr>
+          <w:rFonts w:eastAsia="Hannotate TC"/>
+        </w:rPr>
+        <w:t>minimal AI help.</w:t>
+      </w:r>
     </w:p>
     <w:sectPr>
       <w:pgSz w:w="11906" w:h="16838"/>
@@ -5393,7 +5527,6 @@
     <w:next w:val="Normal"/>
     <w:link w:val="Heading3Char"/>
     <w:uiPriority w:val="9"/>
-    <w:semiHidden/>
     <w:unhideWhenUsed/>
     <w:qFormat/>
     <w:rsid w:val="00BF0212"/>
@@ -5545,6 +5678,7 @@
   <w:style w:type="character" w:default="1" w:styleId="DefaultParagraphFont">
     <w:name w:val="Default Paragraph Font"/>
     <w:uiPriority w:val="1"/>
+    <w:semiHidden/>
     <w:unhideWhenUsed/>
   </w:style>
   <w:style w:type="table" w:default="1" w:styleId="TableNormal">
@@ -5599,7 +5733,6 @@
     <w:basedOn w:val="DefaultParagraphFont"/>
     <w:link w:val="Heading3"/>
     <w:uiPriority w:val="9"/>
-    <w:semiHidden/>
     <w:rsid w:val="00BF0212"/>
     <w:rPr>
       <w:rFonts w:eastAsiaTheme="majorEastAsia" w:cstheme="majorBidi"/>
@@ -5949,6 +6082,15 @@
     <w:uiPriority w:val="99"/>
     <w:rsid w:val="00543F48"/>
   </w:style>
+  <w:style w:type="paragraph" w:styleId="NoSpacing">
+    <w:name w:val="No Spacing"/>
+    <w:uiPriority w:val="1"/>
+    <w:qFormat/>
+    <w:rsid w:val="000F29E3"/>
+    <w:pPr>
+      <w:spacing w:after="0" w:line="240" w:lineRule="auto"/>
+    </w:pPr>
+  </w:style>
 </w:styles>
 </file>
 

</xml_diff>